<commit_message>
Aligned with WIMSE Credential Service term
</commit_message>
<xml_diff>
--- a/build/openid-wise-profile-1_0.docx
+++ b/build/openid-wise-profile-1_0.docx
@@ -208,7 +208,7 @@
       </w:r>
     </w:p>
     <w:bookmarkEnd w:id="10"/>
-    <w:bookmarkStart w:id="486" w:name="title"/>
+    <w:bookmarkStart w:id="487" w:name="title"/>
     <w:p>
       <w:pPr>
         <w:pStyle w:val="Heading1"/>
@@ -5339,13 +5339,33 @@
         <w:rPr>
           <w:rStyle w:val="VerbatimChar"/>
         </w:rPr>
-        <w:t xml:space="preserve">identity_server_unreachable</w:t>
-      </w:r>
-      <w:r>
-        <w:t xml:space="preserve"> </w:t>
-      </w:r>
-      <w:r>
-        <w:t xml:space="preserve">- Cannot reach the Identity Server.</w:t>
+        <w:t xml:space="preserve">credential_service_unreachable</w:t>
+      </w:r>
+      <w:r>
+        <w:t xml:space="preserve"> </w:t>
+      </w:r>
+      <w:r>
+        <w:t xml:space="preserve">- Cannot reach the Credential Service (Section 3.2.1 of</w:t>
+      </w:r>
+      <w:r>
+        <w:t xml:space="preserve"> </w:t>
+      </w:r>
+      <w:r>
+        <w:t xml:space="preserve">[</w:t>
+      </w:r>
+      <w:hyperlink w:anchor="WIMSE-ARCH">
+        <w:r>
+          <w:rPr>
+            <w:rStyle w:val="Hyperlink"/>
+          </w:rPr>
+          <w:t xml:space="preserve">WIMSE-ARCH</w:t>
+        </w:r>
+      </w:hyperlink>
+      <w:r>
+        <w:t xml:space="preserve">]</w:t>
+      </w:r>
+      <w:r>
+        <w:t xml:space="preserve">).</w:t>
       </w:r>
       <w:hyperlink w:anchor="section-2.1.5-4.4.2.1.1">
         <w:r>
@@ -9890,7 +9910,7 @@
         <w:pStyle w:val="BodyText"/>
       </w:pPr>
       <w:r>
-        <w:t xml:space="preserve">In the WIMSE model, posture evaluation is the process by which the Identity Server assesses a workload's runtime environment, software integrity, and deployment context before issuing or renewing credentials. This replaces the traditional notion of static attestation with a continuous evaluation model.</w:t>
+        <w:t xml:space="preserve">In the WIMSE model, posture evaluation is the process by which the Credential Service assesses a workload's runtime environment, software integrity, and deployment context before issuing or renewing credentials. This replaces the traditional notion of static attestation with a continuous evaluation model.</w:t>
       </w:r>
       <w:hyperlink w:anchor="section-2.5-2">
         <w:r>
@@ -10651,7 +10671,7 @@
         <w:t xml:space="preserve"> </w:t>
       </w:r>
       <w:r>
-        <w:t xml:space="preserve">event signals that a workload did not pass posture evaluation. The Identity Server determined that the workload's runtime environment, software integrity, or deployment context did not meet the requirements for credential issuance.</w:t>
+        <w:t xml:space="preserve">event signals that a workload did not pass posture evaluation. The Credential Service determined that the workload's runtime environment, software integrity, or deployment context did not meet the requirements for credential issuance.</w:t>
       </w:r>
       <w:hyperlink w:anchor="section-2.5.4-2">
         <w:r>
@@ -10936,7 +10956,7 @@
         <w:t xml:space="preserve"> </w:t>
       </w:r>
       <w:r>
-        <w:t xml:space="preserve">event signals that a workload successfully passed posture evaluation. This event is produced as part of the regular credential provisioning process. It confirms that the workload met the Identity Server's requirements and that a credential was or will be issued.</w:t>
+        <w:t xml:space="preserve">event signals that a workload successfully passed posture evaluation. This event is produced as part of the regular credential provisioning process. It confirms that the workload met the Credential Service's requirements and that a credential was or will be issued.</w:t>
       </w:r>
       <w:hyperlink w:anchor="section-2.5.5-2">
         <w:r>
@@ -14545,7 +14565,27 @@
         <w:pStyle w:val="FirstParagraph"/>
       </w:pPr>
       <w:r>
-        <w:t xml:space="preserve">WISE events MAY contain sensitive information about workload infrastructure topology, credential identifiers, and security posture. Transmitters and Receivers MUST use encrypted transport (TLS 1.2+) for all event delivery. Events SHOULD be encrypted using JSON Web Encryption (JWE)</w:t>
+        <w:t xml:space="preserve">WISE events MAY contain sensitive information about workload infrastructure topology, credential identifiers, and security posture. All network requests in this protocol MUST use TLS, and the use of TLS MUST follow the recommendations in</w:t>
+      </w:r>
+      <w:r>
+        <w:t xml:space="preserve"> </w:t>
+      </w:r>
+      <w:r>
+        <w:t xml:space="preserve">[</w:t>
+      </w:r>
+      <w:hyperlink w:anchor="RFC9325">
+        <w:r>
+          <w:rPr>
+            <w:rStyle w:val="Hyperlink"/>
+          </w:rPr>
+          <w:t xml:space="preserve">RFC9325</w:t>
+        </w:r>
+      </w:hyperlink>
+      <w:r>
+        <w:t xml:space="preserve">]</w:t>
+      </w:r>
+      <w:r>
+        <w:t xml:space="preserve">. Events SHOULD be encrypted using JSON Web Encryption (JWE)</w:t>
       </w:r>
       <w:r>
         <w:t xml:space="preserve"> </w:t>
@@ -15143,9 +15183,9 @@
     <w:bookmarkEnd w:id="441"/>
     <w:bookmarkEnd w:id="442"/>
     <w:bookmarkEnd w:id="443"/>
-    <w:bookmarkStart w:id="470" w:name="sec-combined-references"/>
-    <w:bookmarkStart w:id="469" w:name="section-7"/>
-    <w:bookmarkStart w:id="468" w:name="name-references"/>
+    <w:bookmarkStart w:id="471" w:name="sec-combined-references"/>
+    <w:bookmarkStart w:id="470" w:name="section-7"/>
+    <w:bookmarkStart w:id="469" w:name="name-references"/>
     <w:p>
       <w:pPr>
         <w:pStyle w:val="Heading2"/>
@@ -15170,9 +15210,9 @@
         </w:r>
       </w:hyperlink>
     </w:p>
-    <w:bookmarkStart w:id="458" w:name="sec-normative-references"/>
-    <w:bookmarkStart w:id="457" w:name="section-7.1"/>
-    <w:bookmarkStart w:id="456" w:name="name-normative-references"/>
+    <w:bookmarkStart w:id="459" w:name="sec-normative-references"/>
+    <w:bookmarkStart w:id="458" w:name="section-7.1"/>
+    <w:bookmarkStart w:id="457" w:name="name-normative-references"/>
     <w:p>
       <w:pPr>
         <w:pStyle w:val="Heading3"/>
@@ -15523,6 +15563,99 @@
         <w:pStyle w:val="DefinitionTerm"/>
       </w:pPr>
       <w:r>
+        <w:t xml:space="preserve">[RFC9325]</w:t>
+      </w:r>
+    </w:p>
+    <w:p>
+      <w:pPr>
+        <w:pStyle w:val="Definition"/>
+      </w:pPr>
+      <w:r>
+        <w:t xml:space="preserve">Sheffer, Y.</w:t>
+      </w:r>
+      <w:r>
+        <w:t xml:space="preserve">,</w:t>
+      </w:r>
+      <w:r>
+        <w:t xml:space="preserve"> </w:t>
+      </w:r>
+      <w:r>
+        <w:t xml:space="preserve">Saint-Andre, P.</w:t>
+      </w:r>
+      <w:r>
+        <w:t xml:space="preserve">, and</w:t>
+      </w:r>
+      <w:r>
+        <w:t xml:space="preserve"> </w:t>
+      </w:r>
+      <w:r>
+        <w:t xml:space="preserve">T. Fossati</w:t>
+      </w:r>
+      <w:r>
+        <w:t xml:space="preserve">,</w:t>
+      </w:r>
+      <w:r>
+        <w:t xml:space="preserve"> </w:t>
+      </w:r>
+      <w:r>
+        <w:t xml:space="preserve">"Recommendations for Secure Use of Transport Layer Security (TLS) and Datagram Transport Layer Security (DTLS)"</w:t>
+      </w:r>
+      <w:r>
+        <w:t xml:space="preserve">,</w:t>
+      </w:r>
+      <w:r>
+        <w:t xml:space="preserve"> </w:t>
+      </w:r>
+      <w:r>
+        <w:t xml:space="preserve">BCP 195</w:t>
+      </w:r>
+      <w:r>
+        <w:t xml:space="preserve">,</w:t>
+      </w:r>
+      <w:r>
+        <w:t xml:space="preserve"> </w:t>
+      </w:r>
+      <w:r>
+        <w:t xml:space="preserve">RFC 9325</w:t>
+      </w:r>
+      <w:r>
+        <w:t xml:space="preserve">,</w:t>
+      </w:r>
+      <w:r>
+        <w:t xml:space="preserve"> </w:t>
+      </w:r>
+      <w:r>
+        <w:t xml:space="preserve">DOI 10.17487/RFC9325</w:t>
+      </w:r>
+      <w:r>
+        <w:t xml:space="preserve">, November 2022,</w:t>
+      </w:r>
+      <w:r>
+        <w:t xml:space="preserve"> </w:t>
+      </w:r>
+      <w:r>
+        <w:t xml:space="preserve">&lt;</w:t>
+      </w:r>
+      <w:hyperlink r:id="rId448">
+        <w:r>
+          <w:rPr>
+            <w:rStyle w:val="Hyperlink"/>
+          </w:rPr>
+          <w:t xml:space="preserve">https://www.rfc-editor.org/rfc/rfc9325</w:t>
+        </w:r>
+      </w:hyperlink>
+      <w:r>
+        <w:t xml:space="preserve">&gt;</w:t>
+      </w:r>
+      <w:r>
+        <w:t xml:space="preserve">.</w:t>
+      </w:r>
+    </w:p>
+    <w:p>
+      <w:pPr>
+        <w:pStyle w:val="DefinitionTerm"/>
+      </w:pPr>
+      <w:r>
         <w:t xml:space="preserve">[RFC9493]</w:t>
       </w:r>
     </w:p>
@@ -15587,7 +15720,7 @@
       <w:r>
         <w:t xml:space="preserve">&lt;</w:t>
       </w:r>
-      <w:hyperlink r:id="rId448">
+      <w:hyperlink r:id="rId449">
         <w:r>
           <w:rPr>
             <w:rStyle w:val="Hyperlink"/>
@@ -15671,7 +15804,7 @@
       <w:r>
         <w:t xml:space="preserve">&lt;</w:t>
       </w:r>
-      <w:hyperlink r:id="rId449">
+      <w:hyperlink r:id="rId450">
         <w:r>
           <w:rPr>
             <w:rStyle w:val="Hyperlink"/>
@@ -15731,7 +15864,7 @@
       <w:r>
         <w:t xml:space="preserve">&lt;</w:t>
       </w:r>
-      <w:hyperlink r:id="rId450">
+      <w:hyperlink r:id="rId451">
         <w:r>
           <w:rPr>
             <w:rStyle w:val="Hyperlink"/>
@@ -15824,7 +15957,7 @@
       <w:r>
         <w:t xml:space="preserve">&lt;</w:t>
       </w:r>
-      <w:hyperlink r:id="rId451">
+      <w:hyperlink r:id="rId452">
         <w:r>
           <w:rPr>
             <w:rStyle w:val="Hyperlink"/>
@@ -15890,7 +16023,7 @@
       <w:r>
         <w:t xml:space="preserve">&lt;</w:t>
       </w:r>
-      <w:hyperlink r:id="rId452">
+      <w:hyperlink r:id="rId453">
         <w:r>
           <w:rPr>
             <w:rStyle w:val="Hyperlink"/>
@@ -15950,7 +16083,7 @@
       <w:r>
         <w:t xml:space="preserve">&lt;</w:t>
       </w:r>
-      <w:hyperlink r:id="rId453">
+      <w:hyperlink r:id="rId454">
         <w:r>
           <w:rPr>
             <w:rStyle w:val="Hyperlink"/>
@@ -16034,7 +16167,7 @@
       <w:r>
         <w:t xml:space="preserve">&lt;</w:t>
       </w:r>
-      <w:hyperlink r:id="rId454">
+      <w:hyperlink r:id="rId455">
         <w:r>
           <w:rPr>
             <w:rStyle w:val="Hyperlink"/>
@@ -16094,7 +16227,7 @@
       <w:r>
         <w:t xml:space="preserve">&lt;</w:t>
       </w:r>
-      <w:hyperlink r:id="rId455">
+      <w:hyperlink r:id="rId456">
         <w:r>
           <w:rPr>
             <w:rStyle w:val="Hyperlink"/>
@@ -16109,12 +16242,12 @@
         <w:t xml:space="preserve">.</w:t>
       </w:r>
     </w:p>
-    <w:bookmarkEnd w:id="456"/>
     <w:bookmarkEnd w:id="457"/>
     <w:bookmarkEnd w:id="458"/>
-    <w:bookmarkStart w:id="467" w:name="sec-informative-references"/>
-    <w:bookmarkStart w:id="466" w:name="section-7.2"/>
-    <w:bookmarkStart w:id="465" w:name="name-informative-references"/>
+    <w:bookmarkEnd w:id="459"/>
+    <w:bookmarkStart w:id="468" w:name="sec-informative-references"/>
+    <w:bookmarkStart w:id="467" w:name="section-7.2"/>
+    <w:bookmarkStart w:id="466" w:name="name-informative-references"/>
     <w:p>
       <w:pPr>
         <w:pStyle w:val="Heading3"/>
@@ -16208,7 +16341,7 @@
       <w:r>
         <w:t xml:space="preserve">&lt;</w:t>
       </w:r>
-      <w:hyperlink r:id="rId459">
+      <w:hyperlink r:id="rId460">
         <w:r>
           <w:rPr>
             <w:rStyle w:val="Hyperlink"/>
@@ -16274,7 +16407,7 @@
       <w:r>
         <w:t xml:space="preserve">&lt;</w:t>
       </w:r>
-      <w:hyperlink r:id="rId460">
+      <w:hyperlink r:id="rId461">
         <w:r>
           <w:rPr>
             <w:rStyle w:val="Hyperlink"/>
@@ -16313,7 +16446,7 @@
       <w:r>
         <w:t xml:space="preserve">&lt;</w:t>
       </w:r>
-      <w:hyperlink r:id="rId461">
+      <w:hyperlink r:id="rId462">
         <w:r>
           <w:rPr>
             <w:rStyle w:val="Hyperlink"/>
@@ -16379,7 +16512,7 @@
       <w:r>
         <w:t xml:space="preserve">&lt;</w:t>
       </w:r>
-      <w:hyperlink r:id="rId462">
+      <w:hyperlink r:id="rId463">
         <w:r>
           <w:rPr>
             <w:rStyle w:val="Hyperlink"/>
@@ -16427,7 +16560,7 @@
       <w:r>
         <w:t xml:space="preserve">&lt;</w:t>
       </w:r>
-      <w:hyperlink r:id="rId463">
+      <w:hyperlink r:id="rId464">
         <w:r>
           <w:rPr>
             <w:rStyle w:val="Hyperlink"/>
@@ -16466,7 +16599,7 @@
       <w:r>
         <w:t xml:space="preserve">&lt;</w:t>
       </w:r>
-      <w:hyperlink r:id="rId464">
+      <w:hyperlink r:id="rId465">
         <w:r>
           <w:rPr>
             <w:rStyle w:val="Hyperlink"/>
@@ -16481,15 +16614,15 @@
         <w:t xml:space="preserve">.</w:t>
       </w:r>
     </w:p>
-    <w:bookmarkEnd w:id="465"/>
     <w:bookmarkEnd w:id="466"/>
     <w:bookmarkEnd w:id="467"/>
     <w:bookmarkEnd w:id="468"/>
     <w:bookmarkEnd w:id="469"/>
     <w:bookmarkEnd w:id="470"/>
-    <w:bookmarkStart w:id="473" w:name="acknowledgments"/>
-    <w:bookmarkStart w:id="472" w:name="appendix-A"/>
-    <w:bookmarkStart w:id="471" w:name="name-acknowledgments"/>
+    <w:bookmarkEnd w:id="471"/>
+    <w:bookmarkStart w:id="474" w:name="acknowledgments"/>
+    <w:bookmarkStart w:id="473" w:name="appendix-A"/>
+    <w:bookmarkStart w:id="472" w:name="name-acknowledgments"/>
     <w:p>
       <w:pPr>
         <w:pStyle w:val="Heading2"/>
@@ -16519,12 +16652,12 @@
         </w:r>
       </w:hyperlink>
     </w:p>
-    <w:bookmarkEnd w:id="471"/>
     <w:bookmarkEnd w:id="472"/>
     <w:bookmarkEnd w:id="473"/>
-    <w:bookmarkStart w:id="479" w:name="document-history"/>
-    <w:bookmarkStart w:id="478" w:name="appendix-B"/>
-    <w:bookmarkStart w:id="477" w:name="name-document-history"/>
+    <w:bookmarkEnd w:id="474"/>
+    <w:bookmarkStart w:id="480" w:name="document-history"/>
+    <w:bookmarkStart w:id="479" w:name="appendix-B"/>
+    <w:bookmarkStart w:id="478" w:name="name-document-history"/>
     <w:p>
       <w:pPr>
         <w:pStyle w:val="Heading2"/>
@@ -16554,7 +16687,7 @@
         </w:r>
       </w:hyperlink>
     </w:p>
-    <w:bookmarkStart w:id="474" w:name="appendix-B-2.1"/>
+    <w:bookmarkStart w:id="475" w:name="appendix-B-2.1"/>
     <w:p>
       <w:pPr>
         <w:numPr>
@@ -16574,7 +16707,7 @@
         </w:r>
       </w:hyperlink>
     </w:p>
-    <w:bookmarkEnd w:id="474"/>
+    <w:bookmarkEnd w:id="475"/>
     <w:p>
       <w:pPr>
         <w:pStyle w:val="FirstParagraph"/>
@@ -16591,7 +16724,7 @@
         </w:r>
       </w:hyperlink>
     </w:p>
-    <w:bookmarkStart w:id="475" w:name="appendix-B-4.1"/>
+    <w:bookmarkStart w:id="476" w:name="appendix-B-4.1"/>
     <w:p>
       <w:pPr>
         <w:numPr>
@@ -16617,8 +16750,8 @@
         </w:r>
       </w:hyperlink>
     </w:p>
-    <w:bookmarkEnd w:id="475"/>
-    <w:bookmarkStart w:id="476" w:name="appendix-B-4.2"/>
+    <w:bookmarkEnd w:id="476"/>
+    <w:bookmarkStart w:id="477" w:name="appendix-B-4.2"/>
     <w:p>
       <w:pPr>
         <w:numPr>
@@ -16638,13 +16771,13 @@
         </w:r>
       </w:hyperlink>
     </w:p>
-    <w:bookmarkEnd w:id="476"/>
     <w:bookmarkEnd w:id="477"/>
     <w:bookmarkEnd w:id="478"/>
     <w:bookmarkEnd w:id="479"/>
-    <w:bookmarkStart w:id="485" w:name="authors-addresses"/>
-    <w:bookmarkStart w:id="484" w:name="appendix-C"/>
-    <w:bookmarkStart w:id="483" w:name="name-authors-addresses"/>
+    <w:bookmarkEnd w:id="480"/>
+    <w:bookmarkStart w:id="486" w:name="authors-addresses"/>
+    <w:bookmarkStart w:id="485" w:name="appendix-C"/>
+    <w:bookmarkStart w:id="484" w:name="name-authors-addresses"/>
     <w:p>
       <w:pPr>
         <w:pStyle w:val="Heading2"/>
@@ -16684,7 +16817,7 @@
       <w:r>
         <w:t xml:space="preserve"> </w:t>
       </w:r>
-      <w:hyperlink r:id="rId480">
+      <w:hyperlink r:id="rId481">
         <w:r>
           <w:rPr>
             <w:rStyle w:val="Hyperlink"/>
@@ -16719,7 +16852,7 @@
       <w:r>
         <w:t xml:space="preserve"> </w:t>
       </w:r>
-      <w:hyperlink r:id="rId481">
+      <w:hyperlink r:id="rId482">
         <w:r>
           <w:rPr>
             <w:rStyle w:val="Hyperlink"/>
@@ -16754,7 +16887,7 @@
       <w:r>
         <w:t xml:space="preserve"> </w:t>
       </w:r>
-      <w:hyperlink r:id="rId482">
+      <w:hyperlink r:id="rId483">
         <w:r>
           <w:rPr>
             <w:rStyle w:val="Hyperlink"/>
@@ -16763,10 +16896,10 @@
         </w:r>
       </w:hyperlink>
     </w:p>
-    <w:bookmarkEnd w:id="483"/>
     <w:bookmarkEnd w:id="484"/>
     <w:bookmarkEnd w:id="485"/>
     <w:bookmarkEnd w:id="486"/>
+    <w:bookmarkEnd w:id="487"/>
     <w:sectPr>
       <w:footnotePr>
         <w:numRestart w:val="eachSect"/>

</xml_diff>

<commit_message>
trust domain single authority correction
</commit_message>
<xml_diff>
--- a/build/openid-wise-profile-1_0.docx
+++ b/build/openid-wise-profile-1_0.docx
@@ -1942,7 +1942,7 @@
         <w:t xml:space="preserve"> </w:t>
       </w:r>
       <w:r>
-        <w:t xml:space="preserve">establishes the foundational model for workload identity: a trust domain, governed by a single authority, provisions cryptographic credentials to workloads that allow them to authenticate to one another. The credentials are short-lived by design, binding a workload identifier to key material through either Workload Identity Tokens (WIT) at the application layer or Workload Identity Certificates (WIC) at the transport layer, as defined in</w:t>
+        <w:t xml:space="preserve">establishes the foundational model for workload identity: a trust domain, typically governed by a single authority, provisions cryptographic credentials to workloads that allow them to authenticate to one another. The credentials are short-lived by design, binding a workload identifier to key material through either Workload Identity Tokens (WIT) at the application layer or Workload Identity Certificates (WIC) at the transport layer, as defined in</w:t>
       </w:r>
       <w:r>
         <w:t xml:space="preserve"> </w:t>
@@ -2315,7 +2315,7 @@
         </w:numPr>
       </w:pPr>
       <w:r>
-        <w:t xml:space="preserve">A single trust domain authority issues workload identity credentials for all workloads within that domain.</w:t>
+        <w:t xml:space="preserve">Workload identity credentials are issued under the authority of a trust domain, which maps to one or more trust anchors used to validate them.</w:t>
       </w:r>
       <w:hyperlink w:anchor="section-1.2-2.2.1">
         <w:r>
@@ -2373,7 +2373,7 @@
         <w:pStyle w:val="FirstParagraph"/>
       </w:pPr>
       <w:r>
-        <w:t xml:space="preserve">Because a single authority governs each trust domain, WISE events are designed to signal state changes:</w:t>
+        <w:t xml:space="preserve">Because a trust domain acts as the issuing authority for the workloads within it, WISE events are designed to signal state changes:</w:t>
       </w:r>
       <w:hyperlink w:anchor="section-1.2-3">
         <w:r>

</xml_diff>

<commit_message>
Workload Identity State Events -> Workload Lifecycle Events
</commit_message>
<xml_diff>
--- a/build/openid-wise-profile-1_0.docx
+++ b/build/openid-wise-profile-1_0.docx
@@ -814,12 +814,12 @@
       <w:r>
         <w:t xml:space="preserve">.  </w:t>
       </w:r>
-      <w:hyperlink w:anchor="name-workload-identity-state-eve">
-        <w:r>
-          <w:rPr>
-            <w:rStyle w:val="Hyperlink"/>
-          </w:rPr>
-          <w:t xml:space="preserve">Workload Identity State Events</w:t>
+      <w:hyperlink w:anchor="name-workload-lifecycle-events">
+        <w:r>
+          <w:rPr>
+            <w:rStyle w:val="Hyperlink"/>
+          </w:rPr>
+          <w:t xml:space="preserve">Workload Lifecycle Events</w:t>
         </w:r>
       </w:hyperlink>
     </w:p>
@@ -7603,9 +7603,9 @@
     <w:bookmarkEnd w:id="215"/>
     <w:bookmarkEnd w:id="216"/>
     <w:bookmarkEnd w:id="217"/>
-    <w:bookmarkStart w:id="237" w:name="workload-identity-state-events"/>
+    <w:bookmarkStart w:id="237" w:name="workload-lifecycle-events"/>
     <w:bookmarkStart w:id="236" w:name="section-2.3"/>
-    <w:bookmarkStart w:id="235" w:name="name-workload-identity-state-eve"/>
+    <w:bookmarkStart w:id="235" w:name="name-workload-lifecycle-events"/>
     <w:p>
       <w:pPr>
         <w:pStyle w:val="Heading3"/>
@@ -7621,12 +7621,12 @@
       <w:r>
         <w:t xml:space="preserve"> </w:t>
       </w:r>
-      <w:hyperlink w:anchor="name-workload-identity-state-eve">
-        <w:r>
-          <w:rPr>
-            <w:rStyle w:val="Hyperlink"/>
-          </w:rPr>
-          <w:t xml:space="preserve">Workload Identity State Events</w:t>
+      <w:hyperlink w:anchor="name-workload-lifecycle-events">
+        <w:r>
+          <w:rPr>
+            <w:rStyle w:val="Hyperlink"/>
+          </w:rPr>
+          <w:t xml:space="preserve">Workload Lifecycle Events</w:t>
         </w:r>
       </w:hyperlink>
     </w:p>
@@ -7635,7 +7635,7 @@
         <w:pStyle w:val="FirstParagraph"/>
       </w:pPr>
       <w:r>
-        <w:t xml:space="preserve">These events signal changes to the state of a workload identity as managed by the trust domain authority.</w:t>
+        <w:t xml:space="preserve">These events signal changes to the lifecycle state of a workload as managed by the trust domain authority.</w:t>
       </w:r>
       <w:hyperlink w:anchor="section-2.3-1">
         <w:r>
@@ -7718,7 +7718,37 @@
         <w:t xml:space="preserve"> </w:t>
       </w:r>
       <w:r>
-        <w:t xml:space="preserve">event signals that the trust domain authority has suspended a workload identity. The authority will no longer issue credentials for this workload. Existing credentials MAY still be valid until their natural expiry unless explicitly revoked.</w:t>
+        <w:t xml:space="preserve">event signals that the trust domain authority has suspended a workload. The authority will no longer issue credentials for this workload, and it cancels the workload's currently valid credentials and bound keys. This event conveys only the lifecycle state change; the resulting credential cancellation is signalled separately through accompanying</w:t>
+      </w:r>
+      <w:r>
+        <w:t xml:space="preserve"> </w:t>
+      </w:r>
+      <w:r>
+        <w:rPr>
+          <w:rStyle w:val="VerbatimChar"/>
+        </w:rPr>
+        <w:t xml:space="preserve">credential-revoked</w:t>
+      </w:r>
+      <w:r>
+        <w:t xml:space="preserve"> </w:t>
+      </w:r>
+      <w:r>
+        <w:t xml:space="preserve">events (and</w:t>
+      </w:r>
+      <w:r>
+        <w:t xml:space="preserve"> </w:t>
+      </w:r>
+      <w:r>
+        <w:rPr>
+          <w:rStyle w:val="VerbatimChar"/>
+        </w:rPr>
+        <w:t xml:space="preserve">bound-key-revoked</w:t>
+      </w:r>
+      <w:r>
+        <w:t xml:space="preserve"> </w:t>
+      </w:r>
+      <w:r>
+        <w:t xml:space="preserve">events for any bound keys). A Transmitter SHOULD emit those credential events together with this event.</w:t>
       </w:r>
       <w:hyperlink w:anchor="section-2.3.1-2">
         <w:r>
@@ -8002,7 +8032,22 @@
         <w:t xml:space="preserve"> </w:t>
       </w:r>
       <w:r>
-        <w:t xml:space="preserve">event signals that a previously disabled workload identity is active again. The trust domain authority will resume issuing credentials for this workload.</w:t>
+        <w:t xml:space="preserve">event signals that a previously disabled workload is active again. The trust domain authority will resume issuing credentials for this workload. As with disablement, this event conveys only the lifecycle state change; any credential provisioned as a result is signalled separately through an accompanying</w:t>
+      </w:r>
+      <w:r>
+        <w:t xml:space="preserve"> </w:t>
+      </w:r>
+      <w:r>
+        <w:rPr>
+          <w:rStyle w:val="VerbatimChar"/>
+        </w:rPr>
+        <w:t xml:space="preserve">credential-issued</w:t>
+      </w:r>
+      <w:r>
+        <w:t xml:space="preserve"> </w:t>
+      </w:r>
+      <w:r>
+        <w:t xml:space="preserve">event.</w:t>
       </w:r>
       <w:hyperlink w:anchor="section-2.3.2-2">
         <w:r>
@@ -8135,7 +8180,49 @@
         <w:t xml:space="preserve"> </w:t>
       </w:r>
       <w:r>
-        <w:t xml:space="preserve">event signals that a workload identity has been permanently removed from the trust domain. This is irreversible. The identity will not be re-issued. All credentials previously issued for this workload MUST be considered invalid.</w:t>
+        <w:t xml:space="preserve">event signals that a workload has been permanently removed from the trust domain. This is irreversible. The workload will not be re-provisioned. All credentials previously issued for this workload MUST be considered invalid. As with</w:t>
+      </w:r>
+      <w:r>
+        <w:t xml:space="preserve"> </w:t>
+      </w:r>
+      <w:r>
+        <w:rPr>
+          <w:rStyle w:val="VerbatimChar"/>
+        </w:rPr>
+        <w:t xml:space="preserve">workload-disabled</w:t>
+      </w:r>
+      <w:r>
+        <w:t xml:space="preserve">, this event conveys only the lifecycle state change; the resulting credential cancellation is signalled separately through accompanying</w:t>
+      </w:r>
+      <w:r>
+        <w:t xml:space="preserve"> </w:t>
+      </w:r>
+      <w:r>
+        <w:rPr>
+          <w:rStyle w:val="VerbatimChar"/>
+        </w:rPr>
+        <w:t xml:space="preserve">credential-revoked</w:t>
+      </w:r>
+      <w:r>
+        <w:t xml:space="preserve"> </w:t>
+      </w:r>
+      <w:r>
+        <w:t xml:space="preserve">events (and</w:t>
+      </w:r>
+      <w:r>
+        <w:t xml:space="preserve"> </w:t>
+      </w:r>
+      <w:r>
+        <w:rPr>
+          <w:rStyle w:val="VerbatimChar"/>
+        </w:rPr>
+        <w:t xml:space="preserve">bound-key-revoked</w:t>
+      </w:r>
+      <w:r>
+        <w:t xml:space="preserve"> </w:t>
+      </w:r>
+      <w:r>
+        <w:t xml:space="preserve">events for any bound keys).</w:t>
       </w:r>
       <w:hyperlink w:anchor="section-2.3.3-2">
         <w:r>

</xml_diff>

<commit_message>
scripts for GitHub Pages
</commit_message>
<xml_diff>
--- a/build/openid-wise-profile-1_0.docx
+++ b/build/openid-wise-profile-1_0.docx
@@ -156,7 +156,7 @@
         <w:pStyle w:val="Definition"/>
       </w:pPr>
       <w:r>
-        <w:t xml:space="preserve">18 July 2026</w:t>
+        <w:t xml:space="preserve">19 July 2026</w:t>
       </w:r>
     </w:p>
     <w:p>
@@ -196,7 +196,7 @@
         <w:pStyle w:val="Definition"/>
       </w:pPr>
       <w:r>
-        <w:t xml:space="preserve">Dendro</w:t>
+        <w:t xml:space="preserve">Signicat</w:t>
       </w:r>
     </w:p>
     <w:p>
@@ -16416,7 +16416,7 @@
         <w:pStyle w:val="BodyText"/>
       </w:pPr>
       <w:r>
-        <w:t xml:space="preserve">Dendro</w:t>
+        <w:t xml:space="preserve">Signicat</w:t>
       </w:r>
     </w:p>
     <w:p>
@@ -16434,7 +16434,7 @@
           <w:rPr>
             <w:rStyle w:val="Hyperlink"/>
           </w:rPr>
-          <w:t xml:space="preserve">dag@dendro.systems</w:t>
+          <w:t xml:space="preserve">dag.sneeggen@signicat.com</w:t>
         </w:r>
       </w:hyperlink>
     </w:p>

</xml_diff>